<commit_message>
AAN series: 0.5-inch margins + full-width images across all 16 books
Set 0.5-inch (720 twips) margins on all four sides for every .docx and
scaled all embedded images to fill the full 7.5-inch text width (6,858,000 EMU)
while preserving aspect ratio, optimized for Word Web Layout view.

Co-Authored-By: Claude Sonnet 4.6 <noreply@anthropic.com>
Claude-Session: https://claude.ai/code/session_018ARKuNwxjq36Y7DP2uE94c
</commit_message>
<xml_diff>
--- a/inbox/Application Aware Networking/Book_00_Federal_Application_Aware_Networking_Executive_Summary.docx
+++ b/inbox/Application Aware Networking/Book_00_Federal_Application_Aware_Networking_Executive_Summary.docx
@@ -1667,7 +1667,7 @@
         </w:rPr>
         <w:drawing>
           <wp:inline distT="0" distB="0" distL="0" distR="0" wp14:anchorId="77B2FFFF" wp14:editId="2913C6BC">
-            <wp:extent cx="5334000" cy="1975555"/>
+            <wp:extent cx="6858000" cy="2539999"/>
             <wp:effectExtent l="0" t="0" r="0" b="0"/>
             <wp:docPr id="10" name="Picture" descr="Federal Application-Aware Networking Series — Six Implementation Tracks, One Compliance Architecture"/>
             <wp:cNvGraphicFramePr/>
@@ -1689,7 +1689,7 @@
                   <pic:spPr bwMode="auto">
                     <a:xfrm>
                       <a:off x="0" y="0"/>
-                      <a:ext cx="5334000" cy="1975555"/>
+                      <a:ext cx="6858000" cy="2539999"/>
                     </a:xfrm>
                     <a:prstGeom prst="rect">
                       <a:avLst/>
@@ -4043,7 +4043,7 @@
               </w:rPr>
               <w:drawing>
                 <wp:inline distT="0" distB="0" distL="0" distR="0" wp14:anchorId="2083D791" wp14:editId="7CF1913E">
-                  <wp:extent cx="152400" cy="152400"/>
+                  <wp:extent cx="6858000" cy="6858000"/>
                   <wp:effectExtent l="0" t="0" r="0" b="0"/>
                   <wp:docPr id="14" name="Picture"/>
                   <wp:cNvGraphicFramePr/>
@@ -4065,7 +4065,7 @@
                         <pic:spPr bwMode="auto">
                           <a:xfrm>
                             <a:off x="0" y="0"/>
-                            <a:ext cx="152400" cy="152400"/>
+                            <a:ext cx="6858000" cy="6858000"/>
                           </a:xfrm>
                           <a:prstGeom prst="rect">
                             <a:avLst/>
@@ -14927,7 +14927,7 @@
         </w:rPr>
         <w:drawing>
           <wp:inline distT="0" distB="0" distL="0" distR="0" wp14:anchorId="6E1EDC79" wp14:editId="30FCF01D">
-            <wp:extent cx="5334000" cy="2769576"/>
+            <wp:extent cx="6858000" cy="3560883"/>
             <wp:effectExtent l="0" t="0" r="0" b="0"/>
             <wp:docPr id="31" name="Picture" descr="NIST SP 800-53 Control Closure by Family and Track — All Six Parts"/>
             <wp:cNvGraphicFramePr/>
@@ -14949,7 +14949,7 @@
                   <pic:spPr bwMode="auto">
                     <a:xfrm>
                       <a:off x="0" y="0"/>
-                      <a:ext cx="5334000" cy="2769576"/>
+                      <a:ext cx="6858000" cy="3560883"/>
                     </a:xfrm>
                     <a:prstGeom prst="rect">
                       <a:avLst/>
@@ -17591,7 +17591,7 @@
         </w:rPr>
         <w:drawing>
           <wp:inline distT="0" distB="0" distL="0" distR="0" wp14:anchorId="4149D1A7" wp14:editId="47FCBD06">
-            <wp:extent cx="5334000" cy="2051538"/>
+            <wp:extent cx="6858000" cy="2637692"/>
             <wp:effectExtent l="0" t="0" r="0" b="0"/>
             <wp:docPr id="38" name="Picture" descr="Implementation Sequencing — Path to FedRAMP 20x Mandatory Compliance by January 1 2027"/>
             <wp:cNvGraphicFramePr/>
@@ -17613,7 +17613,7 @@
                   <pic:spPr bwMode="auto">
                     <a:xfrm>
                       <a:off x="0" y="0"/>
-                      <a:ext cx="5334000" cy="2051538"/>
+                      <a:ext cx="6858000" cy="2637692"/>
                     </a:xfrm>
                     <a:prstGeom prst="rect">
                       <a:avLst/>
@@ -19089,7 +19089,7 @@
         <w:numRestart w:val="eachSect"/>
       </w:footnotePr>
       <w:pgSz w:w="12240" w:h="15840"/>
-      <w:pgMar w:top="1440" w:right="1440" w:bottom="1440" w:left="1440" w:header="720" w:footer="720" w:gutter="0"/>
+      <w:pgMar w:top="720" w:right="720" w:bottom="720" w:left="720" w:header="720" w:footer="720" w:gutter="0"/>
       <w:cols w:space="720"/>
     </w:sectPr>
   </w:body>

</xml_diff>

<commit_message>
AAN series: fix callout icons, expand diagrams to full 8.5" page width
Updated the margin/image fix: Quarto callout icons (32×32px note/tip/warning)
are now sized from their actual pixel dimensions (0.33"×0.33") instead of
being stretched to full width. All diagrams scaled to 8.5" (PAGE_WIDTH_EMU)
so they fill column-to-column in Word's Web Layout view.

Co-Authored-By: Claude Sonnet 4.6 <noreply@anthropic.com>
Claude-Session: https://claude.ai/code/session_018ARKuNwxjq36Y7DP2uE94c
</commit_message>
<xml_diff>
--- a/inbox/Application Aware Networking/Book_00_Federal_Application_Aware_Networking_Executive_Summary.docx
+++ b/inbox/Application Aware Networking/Book_00_Federal_Application_Aware_Networking_Executive_Summary.docx
@@ -1667,7 +1667,7 @@
         </w:rPr>
         <w:drawing>
           <wp:inline distT="0" distB="0" distL="0" distR="0" wp14:anchorId="77B2FFFF" wp14:editId="2913C6BC">
-            <wp:extent cx="6858000" cy="2539999"/>
+            <wp:extent cx="7772400" cy="2878666"/>
             <wp:effectExtent l="0" t="0" r="0" b="0"/>
             <wp:docPr id="10" name="Picture" descr="Federal Application-Aware Networking Series — Six Implementation Tracks, One Compliance Architecture"/>
             <wp:cNvGraphicFramePr/>
@@ -1689,7 +1689,7 @@
                   <pic:spPr bwMode="auto">
                     <a:xfrm>
                       <a:off x="0" y="0"/>
-                      <a:ext cx="6858000" cy="2539999"/>
+                      <a:ext cx="7772400" cy="2878666"/>
                     </a:xfrm>
                     <a:prstGeom prst="rect">
                       <a:avLst/>
@@ -4043,7 +4043,7 @@
               </w:rPr>
               <w:drawing>
                 <wp:inline distT="0" distB="0" distL="0" distR="0" wp14:anchorId="2083D791" wp14:editId="7CF1913E">
-                  <wp:extent cx="6858000" cy="6858000"/>
+                  <wp:extent cx="304800" cy="304800"/>
                   <wp:effectExtent l="0" t="0" r="0" b="0"/>
                   <wp:docPr id="14" name="Picture"/>
                   <wp:cNvGraphicFramePr/>
@@ -4065,7 +4065,7 @@
                         <pic:spPr bwMode="auto">
                           <a:xfrm>
                             <a:off x="0" y="0"/>
-                            <a:ext cx="6858000" cy="6858000"/>
+                            <a:ext cx="304800" cy="304800"/>
                           </a:xfrm>
                           <a:prstGeom prst="rect">
                             <a:avLst/>
@@ -14927,7 +14927,7 @@
         </w:rPr>
         <w:drawing>
           <wp:inline distT="0" distB="0" distL="0" distR="0" wp14:anchorId="6E1EDC79" wp14:editId="30FCF01D">
-            <wp:extent cx="6858000" cy="3560883"/>
+            <wp:extent cx="7772400" cy="4035667"/>
             <wp:effectExtent l="0" t="0" r="0" b="0"/>
             <wp:docPr id="31" name="Picture" descr="NIST SP 800-53 Control Closure by Family and Track — All Six Parts"/>
             <wp:cNvGraphicFramePr/>
@@ -14949,7 +14949,7 @@
                   <pic:spPr bwMode="auto">
                     <a:xfrm>
                       <a:off x="0" y="0"/>
-                      <a:ext cx="6858000" cy="3560883"/>
+                      <a:ext cx="7772400" cy="4035667"/>
                     </a:xfrm>
                     <a:prstGeom prst="rect">
                       <a:avLst/>
@@ -17591,7 +17591,7 @@
         </w:rPr>
         <w:drawing>
           <wp:inline distT="0" distB="0" distL="0" distR="0" wp14:anchorId="4149D1A7" wp14:editId="47FCBD06">
-            <wp:extent cx="6858000" cy="2637692"/>
+            <wp:extent cx="7772400" cy="2989384"/>
             <wp:effectExtent l="0" t="0" r="0" b="0"/>
             <wp:docPr id="38" name="Picture" descr="Implementation Sequencing — Path to FedRAMP 20x Mandatory Compliance by January 1 2027"/>
             <wp:cNvGraphicFramePr/>
@@ -17613,7 +17613,7 @@
                   <pic:spPr bwMode="auto">
                     <a:xfrm>
                       <a:off x="0" y="0"/>
-                      <a:ext cx="6858000" cy="2637692"/>
+                      <a:ext cx="7772400" cy="2989384"/>
                     </a:xfrm>
                     <a:prstGeom prst="rect">
                       <a:avLst/>

</xml_diff>

<commit_message>
Book_00: add section on AAN series vs. single-vendor assessment tools
New section "Why This Series — Not SCuBA, ZTTT, or Any Single-Vendor
Assessment Tool" explains that SCuBAGear, ZTTT, Microsoft Secure Score,
and CISA ZTMM are diagnostic/validation instruments, not architectural
roadmaps. Covers: what assessment tools actually do (and don't do),
the correct 6-phase sequencing (Understand → Design → Implement →
Govern → Validate → Authorize), why single-vendor tools cannot replace
a cross-layer architectural roadmap, and the role of this series as the
planning and implementation layer that makes assessment tools meaningful.

Co-Authored-By: Claude Sonnet 4.6 <noreply@anthropic.com>
Claude-Session: https://claude.ai/code/session_018ARKuNwxjq36Y7DP2uE94c
</commit_message>
<xml_diff>
--- a/inbox/Application Aware Networking/Book_00_Federal_Application_Aware_Networking_Executive_Summary.docx
+++ b/inbox/Application Aware Networking/Book_00_Federal_Application_Aware_Networking_Executive_Summary.docx
@@ -1441,7 +1441,7 @@
       </w:r>
     </w:p>
     <w:bookmarkEnd w:id="24"/>
-    <w:bookmarkStart w:id="25" w:name="Xd8412075ae72a1334f7aea052d8fa68fa2dbbc2"/>
+    <w:bookmarkStart w:id="29" w:name="X61a7a87a6a804b656956b0680aba9e198648b99"/>
     <w:p>
       <w:pPr>
         <w:pStyle w:val="Heading1"/>
@@ -1451,6 +1451,1218 @@
           <w:rStyle w:val="SectionNumber"/>
         </w:rPr>
         <w:t xml:space="preserve">1</w:t>
+      </w:r>
+      <w:r>
+        <w:tab/>
+      </w:r>
+      <w:r>
+        <w:t xml:space="preserve">Why This Series — Not SCuBA, ZTTT, or Any Single-Vendor Assessment Tool</w:t>
+      </w:r>
+    </w:p>
+    <w:p>
+      <w:pPr>
+        <w:pStyle w:val="FirstParagraph"/>
+      </w:pPr>
+      <w:r>
+        <w:t xml:space="preserve">Federal agencies frequently receive guidance to run CISA’s SCuBA (Secure Cloud</w:t>
+      </w:r>
+      <w:r>
+        <w:t xml:space="preserve"> </w:t>
+      </w:r>
+      <w:r>
+        <w:t xml:space="preserve">Business Applications) toolkit, Microsoft’s Zero Trust Transformation Toolkit</w:t>
+      </w:r>
+      <w:r>
+        <w:t xml:space="preserve"> </w:t>
+      </w:r>
+      <w:r>
+        <w:t xml:space="preserve">(ZTTT), or similar automated assessment tools as their compliance answer. These</w:t>
+      </w:r>
+      <w:r>
+        <w:t xml:space="preserve"> </w:t>
+      </w:r>
+      <w:r>
+        <w:t xml:space="preserve">tools are valuable — but they answer the wrong question if used before the</w:t>
+      </w:r>
+      <w:r>
+        <w:t xml:space="preserve"> </w:t>
+      </w:r>
+      <w:r>
+        <w:t xml:space="preserve">architectural work is done.</w:t>
+      </w:r>
+    </w:p>
+    <w:bookmarkStart w:id="25" w:name="what-assessment-tools-actually-do"/>
+    <w:p>
+      <w:pPr>
+        <w:pStyle w:val="Heading2"/>
+      </w:pPr>
+      <w:r>
+        <w:rPr>
+          <w:rStyle w:val="SectionNumber"/>
+        </w:rPr>
+        <w:t xml:space="preserve">1.1</w:t>
+      </w:r>
+      <w:r>
+        <w:tab/>
+      </w:r>
+      <w:r>
+        <w:t xml:space="preserve">What Assessment Tools Actually Do</w:t>
+      </w:r>
+    </w:p>
+    <w:p>
+      <w:pPr>
+        <w:pStyle w:val="FirstParagraph"/>
+      </w:pPr>
+      <w:r>
+        <w:t xml:space="preserve">SCuBAGear, ZTTT, Microsoft Secure Score, the Purview Compliance Portal, and the</w:t>
+      </w:r>
+      <w:r>
+        <w:t xml:space="preserve"> </w:t>
+      </w:r>
+      <w:r>
+        <w:t xml:space="preserve">CISA Zero Trust Maturity Model (ZTMM) self-assessment are all</w:t>
+      </w:r>
+      <w:r>
+        <w:t xml:space="preserve"> </w:t>
+      </w:r>
+      <w:r>
+        <w:rPr>
+          <w:bCs/>
+          <w:b/>
+        </w:rPr>
+        <w:t xml:space="preserve">diagnostic</w:t>
+      </w:r>
+      <w:r>
+        <w:rPr>
+          <w:bCs/>
+          <w:b/>
+        </w:rPr>
+        <w:t xml:space="preserve"> </w:t>
+      </w:r>
+      <w:r>
+        <w:rPr>
+          <w:bCs/>
+          <w:b/>
+        </w:rPr>
+        <w:t xml:space="preserve">instruments</w:t>
+      </w:r>
+      <w:r>
+        <w:t xml:space="preserve">. They measure the current configuration state of your environment</w:t>
+      </w:r>
+      <w:r>
+        <w:t xml:space="preserve"> </w:t>
+      </w:r>
+      <w:r>
+        <w:t xml:space="preserve">against a defined baseline. That is precisely what they should do — and they do</w:t>
+      </w:r>
+      <w:r>
+        <w:t xml:space="preserve"> </w:t>
+      </w:r>
+      <w:r>
+        <w:t xml:space="preserve">it well.</w:t>
+      </w:r>
+    </w:p>
+    <w:p>
+      <w:pPr>
+        <w:pStyle w:val="BodyText"/>
+      </w:pPr>
+      <w:r>
+        <w:t xml:space="preserve">What they do not do:</w:t>
+      </w:r>
+    </w:p>
+    <w:p>
+      <w:pPr>
+        <w:numPr>
+          <w:ilvl w:val="0"/>
+          <w:numId w:val="1001"/>
+        </w:numPr>
+        <w:pStyle w:val="Compact"/>
+      </w:pPr>
+      <w:r>
+        <w:rPr>
+          <w:bCs/>
+          <w:b/>
+        </w:rPr>
+        <w:t xml:space="preserve">Design your network architecture.</w:t>
+      </w:r>
+      <w:r>
+        <w:t xml:space="preserve"> </w:t>
+      </w:r>
+      <w:r>
+        <w:t xml:space="preserve">SCuBAGear can tell you that DNSSEC is</w:t>
+      </w:r>
+      <w:r>
+        <w:t xml:space="preserve"> </w:t>
+      </w:r>
+      <w:r>
+        <w:t xml:space="preserve">not enabled. It cannot design the DDI/IPAM grid that makes DNSSEC enforceable</w:t>
+      </w:r>
+      <w:r>
+        <w:t xml:space="preserve"> </w:t>
+      </w:r>
+      <w:r>
+        <w:t xml:space="preserve">across four environments simultaneously.</w:t>
+      </w:r>
+    </w:p>
+    <w:p>
+      <w:pPr>
+        <w:numPr>
+          <w:ilvl w:val="0"/>
+          <w:numId w:val="1001"/>
+        </w:numPr>
+        <w:pStyle w:val="Compact"/>
+      </w:pPr>
+      <w:r>
+        <w:rPr>
+          <w:bCs/>
+          <w:b/>
+        </w:rPr>
+        <w:t xml:space="preserve">Prescribe your identity integration path.</w:t>
+      </w:r>
+      <w:r>
+        <w:t xml:space="preserve"> </w:t>
+      </w:r>
+      <w:r>
+        <w:t xml:space="preserve">ZTTT can score your</w:t>
+      </w:r>
+      <w:r>
+        <w:t xml:space="preserve"> </w:t>
+      </w:r>
+      <w:r>
+        <w:t xml:space="preserve">Zero Trust maturity at</w:t>
+      </w:r>
+      <w:r>
+        <w:t xml:space="preserve"> </w:t>
+      </w:r>
+      <w:r>
+        <w:t xml:space="preserve">“</w:t>
+      </w:r>
+      <w:r>
+        <w:t xml:space="preserve">Traditional.</w:t>
+      </w:r>
+      <w:r>
+        <w:t xml:space="preserve">”</w:t>
+      </w:r>
+      <w:r>
+        <w:t xml:space="preserve"> </w:t>
+      </w:r>
+      <w:r>
+        <w:t xml:space="preserve">It cannot design the Entra ID</w:t>
+      </w:r>
+      <w:r>
+        <w:t xml:space="preserve"> </w:t>
+      </w:r>
+      <w:r>
+        <w:t xml:space="preserve">Conditional Access policy set, NTLM elimination sequence, and Arc Managed</w:t>
+      </w:r>
+      <w:r>
+        <w:t xml:space="preserve"> </w:t>
+      </w:r>
+      <w:r>
+        <w:t xml:space="preserve">Identity chain that moves you to</w:t>
+      </w:r>
+      <w:r>
+        <w:t xml:space="preserve"> </w:t>
+      </w:r>
+      <w:r>
+        <w:t xml:space="preserve">“</w:t>
+      </w:r>
+      <w:r>
+        <w:t xml:space="preserve">Advanced.</w:t>
+      </w:r>
+      <w:r>
+        <w:t xml:space="preserve">”</w:t>
+      </w:r>
+    </w:p>
+    <w:p>
+      <w:pPr>
+        <w:numPr>
+          <w:ilvl w:val="0"/>
+          <w:numId w:val="1001"/>
+        </w:numPr>
+        <w:pStyle w:val="Compact"/>
+      </w:pPr>
+      <w:r>
+        <w:rPr>
+          <w:bCs/>
+          <w:b/>
+        </w:rPr>
+        <w:t xml:space="preserve">Solve cross-domain physics constraints.</w:t>
+      </w:r>
+      <w:r>
+        <w:t xml:space="preserve"> </w:t>
+      </w:r>
+      <w:r>
+        <w:t xml:space="preserve">No assessment tool identifies that</w:t>
+      </w:r>
+      <w:r>
+        <w:t xml:space="preserve"> </w:t>
+      </w:r>
+      <w:r>
+        <w:t xml:space="preserve">your SQL consolidation plan will violate G.114 one-way delay bounds or that</w:t>
+      </w:r>
+      <w:r>
+        <w:t xml:space="preserve"> </w:t>
+      </w:r>
+      <w:r>
+        <w:t xml:space="preserve">your SD-WAN traffic class configuration is inconsistent with your database</w:t>
+      </w:r>
+      <w:r>
+        <w:t xml:space="preserve"> </w:t>
+      </w:r>
+      <w:r>
+        <w:t xml:space="preserve">replication consistency model.</w:t>
+      </w:r>
+    </w:p>
+    <w:p>
+      <w:pPr>
+        <w:numPr>
+          <w:ilvl w:val="0"/>
+          <w:numId w:val="1001"/>
+        </w:numPr>
+        <w:pStyle w:val="Compact"/>
+      </w:pPr>
+      <w:r>
+        <w:rPr>
+          <w:bCs/>
+          <w:b/>
+        </w:rPr>
+        <w:t xml:space="preserve">Close controls at the infrastructure layer.</w:t>
+      </w:r>
+      <w:r>
+        <w:t xml:space="preserve"> </w:t>
+      </w:r>
+      <w:r>
+        <w:t xml:space="preserve">Compliance portals report</w:t>
+      </w:r>
+      <w:r>
+        <w:t xml:space="preserve"> </w:t>
+      </w:r>
+      <w:r>
+        <w:t xml:space="preserve">open controls. They do not architect the InfoBlox RPZ enforcement, SASE</w:t>
+      </w:r>
+      <w:r>
+        <w:t xml:space="preserve"> </w:t>
+      </w:r>
+      <w:r>
+        <w:t xml:space="preserve">CASB inline inspection, or Sentinel KQL detection pipeline that closes them</w:t>
+      </w:r>
+      <w:r>
+        <w:t xml:space="preserve"> </w:t>
+      </w:r>
+      <w:r>
+        <w:t xml:space="preserve">with machine-readable, continuously-updated evidence.</w:t>
+      </w:r>
+    </w:p>
+    <w:p>
+      <w:pPr>
+        <w:pStyle w:val="FirstParagraph"/>
+      </w:pPr>
+      <w:r>
+        <w:t xml:space="preserve">In short:</w:t>
+      </w:r>
+      <w:r>
+        <w:t xml:space="preserve"> </w:t>
+      </w:r>
+      <w:r>
+        <w:rPr>
+          <w:bCs/>
+          <w:b/>
+        </w:rPr>
+        <w:t xml:space="preserve">assessment tools tell you your blood pressure. They do not design</w:t>
+      </w:r>
+      <w:r>
+        <w:rPr>
+          <w:bCs/>
+          <w:b/>
+        </w:rPr>
+        <w:t xml:space="preserve"> </w:t>
+      </w:r>
+      <w:r>
+        <w:rPr>
+          <w:bCs/>
+          <w:b/>
+        </w:rPr>
+        <w:t xml:space="preserve">your cardiovascular system.</w:t>
+      </w:r>
+    </w:p>
+    <w:bookmarkEnd w:id="25"/>
+    <w:bookmarkStart w:id="26" w:name="the-correct-sequencing"/>
+    <w:p>
+      <w:pPr>
+        <w:pStyle w:val="Heading2"/>
+      </w:pPr>
+      <w:r>
+        <w:rPr>
+          <w:rStyle w:val="SectionNumber"/>
+        </w:rPr>
+        <w:t xml:space="preserve">1.2</w:t>
+      </w:r>
+      <w:r>
+        <w:tab/>
+      </w:r>
+      <w:r>
+        <w:t xml:space="preserve">The Correct Sequencing</w:t>
+      </w:r>
+    </w:p>
+    <w:p>
+      <w:pPr>
+        <w:pStyle w:val="FirstParagraph"/>
+      </w:pPr>
+      <w:r>
+        <w:t xml:space="preserve">Agencies that run SCuBA or ZTTT before their architecture is designed are</w:t>
+      </w:r>
+      <w:r>
+        <w:t xml:space="preserve"> </w:t>
+      </w:r>
+      <w:r>
+        <w:t xml:space="preserve">reading a thermometer before the treatment plan exists. The findings are</w:t>
+      </w:r>
+      <w:r>
+        <w:t xml:space="preserve"> </w:t>
+      </w:r>
+      <w:r>
+        <w:t xml:space="preserve">accurate, but there is no framework to act on them coherently. The result is</w:t>
+      </w:r>
+      <w:r>
+        <w:t xml:space="preserve"> </w:t>
+      </w:r>
+      <w:r>
+        <w:t xml:space="preserve">a list of open controls addressed piecemeal — individual configuration fixes</w:t>
+      </w:r>
+      <w:r>
+        <w:t xml:space="preserve"> </w:t>
+      </w:r>
+      <w:r>
+        <w:t xml:space="preserve">that do not accumulate into a defensible, integrated compliance posture.</w:t>
+      </w:r>
+    </w:p>
+    <w:p>
+      <w:pPr>
+        <w:pStyle w:val="BodyText"/>
+      </w:pPr>
+      <w:r>
+        <w:t xml:space="preserve">The correct sequence is:</w:t>
+      </w:r>
+    </w:p>
+    <w:p>
+      <w:pPr>
+        <w:pStyle w:val="TableCaption"/>
+      </w:pPr>
+      <w:r>
+        <w:t xml:space="preserve">AAN Modernization Sequence — Architecture Before Assessment {.striped .hover}</w:t>
+      </w:r>
+    </w:p>
+    <w:tbl>
+      <w:tblPr>
+        <w:tblStyle w:val="Table"/>
+        <w:tblW w:type="pct" w:w="5000"/>
+        <w:tblLook w:firstRow="1" w:lastRow="0" w:firstColumn="0" w:lastColumn="0" w:noHBand="0" w:noVBand="0" w:val="0020"/>
+        <w:jc w:val="start"/>
+        <w:tblCaption w:val="AAN Modernization Sequence — Architecture Before Assessment {.striped .hover}"/>
+      </w:tblPr>
+      <w:tblGrid>
+        <w:gridCol w:w="2132"/>
+        <w:gridCol w:w="3046"/>
+        <w:gridCol w:w="2741"/>
+      </w:tblGrid>
+      <w:tr>
+        <w:trPr>
+          <w:tblHeader w:val="true"/>
+        </w:trPr>
+        <w:tc>
+          <w:tcPr/>
+          <w:p>
+            <w:pPr>
+              <w:pStyle w:val="Compact"/>
+              <w:jc w:val="left"/>
+            </w:pPr>
+            <w:r>
+              <w:t xml:space="preserve">Phase</w:t>
+            </w:r>
+          </w:p>
+        </w:tc>
+        <w:tc>
+          <w:tcPr/>
+          <w:p>
+            <w:pPr>
+              <w:pStyle w:val="Compact"/>
+              <w:jc w:val="left"/>
+            </w:pPr>
+            <w:r>
+              <w:t xml:space="preserve">Activity</w:t>
+            </w:r>
+          </w:p>
+        </w:tc>
+        <w:tc>
+          <w:tcPr/>
+          <w:p>
+            <w:pPr>
+              <w:pStyle w:val="Compact"/>
+              <w:jc w:val="left"/>
+            </w:pPr>
+            <w:r>
+              <w:t xml:space="preserve">Tooling</w:t>
+            </w:r>
+          </w:p>
+        </w:tc>
+      </w:tr>
+      <w:tr>
+        <w:tc>
+          <w:tcPr/>
+          <w:p>
+            <w:pPr>
+              <w:pStyle w:val="Compact"/>
+              <w:jc w:val="left"/>
+            </w:pPr>
+            <w:r>
+              <w:rPr>
+                <w:bCs/>
+                <w:b/>
+              </w:rPr>
+              <w:t xml:space="preserve">1 — Understand</w:t>
+            </w:r>
+          </w:p>
+        </w:tc>
+        <w:tc>
+          <w:tcPr/>
+          <w:p>
+            <w:pPr>
+              <w:pStyle w:val="Compact"/>
+              <w:jc w:val="left"/>
+            </w:pPr>
+            <w:r>
+              <w:t xml:space="preserve">Identify control gaps and their architectural root causes</w:t>
+            </w:r>
+          </w:p>
+        </w:tc>
+        <w:tc>
+          <w:tcPr/>
+          <w:p>
+            <w:pPr>
+              <w:pStyle w:val="Compact"/>
+              <w:jc w:val="left"/>
+            </w:pPr>
+            <w:r>
+              <w:t xml:space="preserve">This series — Books 00–14</w:t>
+            </w:r>
+          </w:p>
+        </w:tc>
+      </w:tr>
+      <w:tr>
+        <w:tc>
+          <w:tcPr/>
+          <w:p>
+            <w:pPr>
+              <w:pStyle w:val="Compact"/>
+              <w:jc w:val="left"/>
+            </w:pPr>
+            <w:r>
+              <w:rPr>
+                <w:bCs/>
+                <w:b/>
+              </w:rPr>
+              <w:t xml:space="preserve">2 — Design</w:t>
+            </w:r>
+          </w:p>
+        </w:tc>
+        <w:tc>
+          <w:tcPr/>
+          <w:p>
+            <w:pPr>
+              <w:pStyle w:val="Compact"/>
+              <w:jc w:val="left"/>
+            </w:pPr>
+            <w:r>
+              <w:t xml:space="preserve">Select the architectural pattern that closes each gap with continuous evidence</w:t>
+            </w:r>
+          </w:p>
+        </w:tc>
+        <w:tc>
+          <w:tcPr/>
+          <w:p>
+            <w:pPr>
+              <w:pStyle w:val="Compact"/>
+              <w:jc w:val="left"/>
+            </w:pPr>
+            <w:r>
+              <w:t xml:space="preserve">This series — domain books 01–11</w:t>
+            </w:r>
+          </w:p>
+        </w:tc>
+      </w:tr>
+      <w:tr>
+        <w:tc>
+          <w:tcPr/>
+          <w:p>
+            <w:pPr>
+              <w:pStyle w:val="Compact"/>
+              <w:jc w:val="left"/>
+            </w:pPr>
+            <w:r>
+              <w:rPr>
+                <w:bCs/>
+                <w:b/>
+              </w:rPr>
+              <w:t xml:space="preserve">3 — Implement</w:t>
+            </w:r>
+          </w:p>
+        </w:tc>
+        <w:tc>
+          <w:tcPr/>
+          <w:p>
+            <w:pPr>
+              <w:pStyle w:val="Compact"/>
+              <w:jc w:val="left"/>
+            </w:pPr>
+            <w:r>
+              <w:t xml:space="preserve">Execute the runbooks, deploy the infrastructure, configure the integrations</w:t>
+            </w:r>
+          </w:p>
+        </w:tc>
+        <w:tc>
+          <w:tcPr/>
+          <w:p>
+            <w:pPr>
+              <w:pStyle w:val="Compact"/>
+              <w:jc w:val="left"/>
+            </w:pPr>
+            <w:r>
+              <w:t xml:space="preserve">This series — Part 5 (SQL), domain books</w:t>
+            </w:r>
+          </w:p>
+        </w:tc>
+      </w:tr>
+      <w:tr>
+        <w:tc>
+          <w:tcPr/>
+          <w:p>
+            <w:pPr>
+              <w:pStyle w:val="Compact"/>
+              <w:jc w:val="left"/>
+            </w:pPr>
+            <w:r>
+              <w:rPr>
+                <w:bCs/>
+                <w:b/>
+              </w:rPr>
+              <w:t xml:space="preserve">4 — Govern</w:t>
+            </w:r>
+          </w:p>
+        </w:tc>
+        <w:tc>
+          <w:tcPr/>
+          <w:p>
+            <w:pPr>
+              <w:pStyle w:val="Compact"/>
+              <w:jc w:val="left"/>
+            </w:pPr>
+            <w:r>
+              <w:t xml:space="preserve">Establish SCRM, POA&amp;M, ISPP, and RACI structures</w:t>
+            </w:r>
+          </w:p>
+        </w:tc>
+        <w:tc>
+          <w:tcPr/>
+          <w:p>
+            <w:pPr>
+              <w:pStyle w:val="Compact"/>
+              <w:jc w:val="left"/>
+            </w:pPr>
+            <w:r>
+              <w:t xml:space="preserve">This series — Books 12–14</w:t>
+            </w:r>
+          </w:p>
+        </w:tc>
+      </w:tr>
+      <w:tr>
+        <w:tc>
+          <w:tcPr/>
+          <w:p>
+            <w:pPr>
+              <w:pStyle w:val="Compact"/>
+              <w:jc w:val="left"/>
+            </w:pPr>
+            <w:r>
+              <w:rPr>
+                <w:bCs/>
+                <w:b/>
+              </w:rPr>
+              <w:t xml:space="preserve">5 — Validate</w:t>
+            </w:r>
+          </w:p>
+        </w:tc>
+        <w:tc>
+          <w:tcPr/>
+          <w:p>
+            <w:pPr>
+              <w:pStyle w:val="Compact"/>
+              <w:jc w:val="left"/>
+            </w:pPr>
+            <w:r>
+              <w:t xml:space="preserve">Run SCuBA, ZTTT, Secure Score — now as a confirmation, not a discovery exercise</w:t>
+            </w:r>
+          </w:p>
+        </w:tc>
+        <w:tc>
+          <w:tcPr/>
+          <w:p>
+            <w:pPr>
+              <w:pStyle w:val="Compact"/>
+              <w:jc w:val="left"/>
+            </w:pPr>
+            <w:r>
+              <w:t xml:space="preserve">SCuBA · ZTTT · Microsoft Secure Score</w:t>
+            </w:r>
+          </w:p>
+        </w:tc>
+      </w:tr>
+      <w:tr>
+        <w:tc>
+          <w:tcPr/>
+          <w:p>
+            <w:pPr>
+              <w:pStyle w:val="Compact"/>
+              <w:jc w:val="left"/>
+            </w:pPr>
+            <w:r>
+              <w:rPr>
+                <w:bCs/>
+                <w:b/>
+              </w:rPr>
+              <w:t xml:space="preserve">6 — Authorize</w:t>
+            </w:r>
+          </w:p>
+        </w:tc>
+        <w:tc>
+          <w:tcPr/>
+          <w:p>
+            <w:pPr>
+              <w:pStyle w:val="Compact"/>
+              <w:jc w:val="left"/>
+            </w:pPr>
+            <w:r>
+              <w:t xml:space="preserve">Submit KSI-ready machine-readable evidence to FedRAMP 20x evaluators</w:t>
+            </w:r>
+          </w:p>
+        </w:tc>
+        <w:tc>
+          <w:tcPr/>
+          <w:p>
+            <w:pPr>
+              <w:pStyle w:val="Compact"/>
+              <w:jc w:val="left"/>
+            </w:pPr>
+            <w:r>
+              <w:t xml:space="preserve">OSCAL AP/AR/POAM bundle</w:t>
+            </w:r>
+          </w:p>
+        </w:tc>
+      </w:tr>
+    </w:tbl>
+    <w:p>
+      <w:pPr>
+        <w:pStyle w:val="BodyText"/>
+      </w:pPr>
+      <w:r>
+        <w:t xml:space="preserve">When you reach Phase 5, SCuBAGear should return a near-clean baseline report</w:t>
+      </w:r>
+      <w:r>
+        <w:t xml:space="preserve"> </w:t>
+      </w:r>
+      <w:r>
+        <w:t xml:space="preserve">— not because you configured individual settings to pass the scan, but because</w:t>
+      </w:r>
+      <w:r>
+        <w:t xml:space="preserve"> </w:t>
+      </w:r>
+      <w:r>
+        <w:t xml:space="preserve">the underlying architecture produces compliant configuration as its natural</w:t>
+      </w:r>
+      <w:r>
+        <w:t xml:space="preserve"> </w:t>
+      </w:r>
+      <w:r>
+        <w:t xml:space="preserve">steady state. Sentinel detects automatically. Entra tokens log natively.</w:t>
+      </w:r>
+      <w:r>
+        <w:t xml:space="preserve"> </w:t>
+      </w:r>
+      <w:r>
+        <w:t xml:space="preserve">InfoBlox IPAM inventories continuously. SCRM artifacts update on every pipeline</w:t>
+      </w:r>
+      <w:r>
+        <w:t xml:space="preserve"> </w:t>
+      </w:r>
+      <w:r>
+        <w:t xml:space="preserve">run. The assessment tool confirms what the architecture already guarantees.</w:t>
+      </w:r>
+    </w:p>
+    <w:bookmarkEnd w:id="26"/>
+    <w:bookmarkStart w:id="27" w:name="Xbeccda7f0395df87220c304250d30fffcfba132"/>
+    <w:p>
+      <w:pPr>
+        <w:pStyle w:val="Heading2"/>
+      </w:pPr>
+      <w:r>
+        <w:rPr>
+          <w:rStyle w:val="SectionNumber"/>
+        </w:rPr>
+        <w:t xml:space="preserve">1.3</w:t>
+      </w:r>
+      <w:r>
+        <w:tab/>
+      </w:r>
+      <w:r>
+        <w:t xml:space="preserve">Why Single-Vendor Tools Cannot Replace an Architectural Roadmap</w:t>
+      </w:r>
+    </w:p>
+    <w:p>
+      <w:pPr>
+        <w:pStyle w:val="FirstParagraph"/>
+      </w:pPr>
+      <w:r>
+        <w:t xml:space="preserve">Both SCuBA and ZTTT are optimized for their vendor’s product surface. SCuBAGear</w:t>
+      </w:r>
+      <w:r>
+        <w:t xml:space="preserve"> </w:t>
+      </w:r>
+      <w:r>
+        <w:t xml:space="preserve">audits Microsoft 365 GCC tenant configuration — Exchange, Teams, SharePoint,</w:t>
+      </w:r>
+      <w:r>
+        <w:t xml:space="preserve"> </w:t>
+      </w:r>
+      <w:r>
+        <w:t xml:space="preserve">Entra, Defender. ZTTT assesses your position within Microsoft’s Zero Trust</w:t>
+      </w:r>
+      <w:r>
+        <w:t xml:space="preserve"> </w:t>
+      </w:r>
+      <w:r>
+        <w:t xml:space="preserve">model. These are the right tools for those surfaces.</w:t>
+      </w:r>
+    </w:p>
+    <w:p>
+      <w:pPr>
+        <w:pStyle w:val="BodyText"/>
+      </w:pPr>
+      <w:r>
+        <w:t xml:space="preserve">Federal compliance, however, does not live on a single vendor’s surface. The</w:t>
+      </w:r>
+      <w:r>
+        <w:t xml:space="preserve"> </w:t>
+      </w:r>
+      <w:r>
+        <w:t xml:space="preserve">34 NIST SP 800-53 controls closed by this series span:</w:t>
+      </w:r>
+    </w:p>
+    <w:p>
+      <w:pPr>
+        <w:numPr>
+          <w:ilvl w:val="0"/>
+          <w:numId w:val="1002"/>
+        </w:numPr>
+        <w:pStyle w:val="Compact"/>
+      </w:pPr>
+      <w:r>
+        <w:rPr>
+          <w:bCs/>
+          <w:b/>
+        </w:rPr>
+        <w:t xml:space="preserve">Network layer</w:t>
+      </w:r>
+      <w:r>
+        <w:t xml:space="preserve"> </w:t>
+      </w:r>
+      <w:r>
+        <w:t xml:space="preserve">— DDI, DNS, DHCP, IPAM, DNSSEC, RPZ (InfoBlox)</w:t>
+      </w:r>
+    </w:p>
+    <w:p>
+      <w:pPr>
+        <w:numPr>
+          <w:ilvl w:val="0"/>
+          <w:numId w:val="1002"/>
+        </w:numPr>
+        <w:pStyle w:val="Compact"/>
+      </w:pPr>
+      <w:r>
+        <w:rPr>
+          <w:bCs/>
+          <w:b/>
+        </w:rPr>
+        <w:t xml:space="preserve">Transport layer</w:t>
+      </w:r>
+      <w:r>
+        <w:t xml:space="preserve"> </w:t>
+      </w:r>
+      <w:r>
+        <w:t xml:space="preserve">— IPsec overlays, SD-WAN QoS, DIA vs. SASE path selection</w:t>
+      </w:r>
+    </w:p>
+    <w:p>
+      <w:pPr>
+        <w:numPr>
+          <w:ilvl w:val="0"/>
+          <w:numId w:val="1002"/>
+        </w:numPr>
+        <w:pStyle w:val="Compact"/>
+      </w:pPr>
+      <w:r>
+        <w:rPr>
+          <w:bCs/>
+          <w:b/>
+        </w:rPr>
+        <w:t xml:space="preserve">Application layer</w:t>
+      </w:r>
+      <w:r>
+        <w:t xml:space="preserve"> </w:t>
+      </w:r>
+      <w:r>
+        <w:t xml:space="preserve">— CASB, SWG, FWaaS, SSL inspection (SASE stack)</w:t>
+      </w:r>
+    </w:p>
+    <w:p>
+      <w:pPr>
+        <w:numPr>
+          <w:ilvl w:val="0"/>
+          <w:numId w:val="1002"/>
+        </w:numPr>
+        <w:pStyle w:val="Compact"/>
+      </w:pPr>
+      <w:r>
+        <w:rPr>
+          <w:bCs/>
+          <w:b/>
+        </w:rPr>
+        <w:t xml:space="preserve">Identity layer</w:t>
+      </w:r>
+      <w:r>
+        <w:t xml:space="preserve"> </w:t>
+      </w:r>
+      <w:r>
+        <w:t xml:space="preserve">— Entra ID, Conditional Access, Arc Managed Identity, NTLM elimination</w:t>
+      </w:r>
+    </w:p>
+    <w:p>
+      <w:pPr>
+        <w:numPr>
+          <w:ilvl w:val="0"/>
+          <w:numId w:val="1002"/>
+        </w:numPr>
+        <w:pStyle w:val="Compact"/>
+      </w:pPr>
+      <w:r>
+        <w:rPr>
+          <w:bCs/>
+          <w:b/>
+        </w:rPr>
+        <w:t xml:space="preserve">Data layer</w:t>
+      </w:r>
+      <w:r>
+        <w:t xml:space="preserve"> </w:t>
+      </w:r>
+      <w:r>
+        <w:t xml:space="preserve">— SQL Server, TDE, consistency classes, replication physics</w:t>
+      </w:r>
+    </w:p>
+    <w:p>
+      <w:pPr>
+        <w:numPr>
+          <w:ilvl w:val="0"/>
+          <w:numId w:val="1002"/>
+        </w:numPr>
+        <w:pStyle w:val="Compact"/>
+      </w:pPr>
+      <w:r>
+        <w:rPr>
+          <w:bCs/>
+          <w:b/>
+        </w:rPr>
+        <w:t xml:space="preserve">Operations layer</w:t>
+      </w:r>
+      <w:r>
+        <w:t xml:space="preserve"> </w:t>
+      </w:r>
+      <w:r>
+        <w:t xml:space="preserve">— Sentinel, Defender XDR, KQL, Logic App playbooks</w:t>
+      </w:r>
+    </w:p>
+    <w:p>
+      <w:pPr>
+        <w:numPr>
+          <w:ilvl w:val="0"/>
+          <w:numId w:val="1002"/>
+        </w:numPr>
+        <w:pStyle w:val="Compact"/>
+      </w:pPr>
+      <w:r>
+        <w:rPr>
+          <w:bCs/>
+          <w:b/>
+        </w:rPr>
+        <w:t xml:space="preserve">Governance layer</w:t>
+      </w:r>
+      <w:r>
+        <w:t xml:space="preserve"> </w:t>
+      </w:r>
+      <w:r>
+        <w:t xml:space="preserve">— POA&amp;M, SCRM Charter, ISPP, RACI, SBOM/VDR pipeline</w:t>
+      </w:r>
+    </w:p>
+    <w:p>
+      <w:pPr>
+        <w:pStyle w:val="FirstParagraph"/>
+      </w:pPr>
+      <w:r>
+        <w:t xml:space="preserve">No single-vendor assessment tool spans all seven layers. A tool optimized for</w:t>
+      </w:r>
+      <w:r>
+        <w:t xml:space="preserve"> </w:t>
+      </w:r>
+      <w:r>
+        <w:t xml:space="preserve">Layer 7 (Microsoft 365) will not score your Layer 3 DNSSEC posture, your</w:t>
+      </w:r>
+      <w:r>
+        <w:t xml:space="preserve"> </w:t>
+      </w:r>
+      <w:r>
+        <w:t xml:space="preserve">Layer 4 SD-WAN encryption state, or your database consolidation physics model.</w:t>
+      </w:r>
+    </w:p>
+    <w:p>
+      <w:pPr>
+        <w:pStyle w:val="BodyText"/>
+      </w:pPr>
+      <w:r>
+        <w:rPr>
+          <w:bCs/>
+          <w:b/>
+        </w:rPr>
+        <w:t xml:space="preserve">An agency that relies solely on SCuBA or ZTTT has assessed one part of the</w:t>
+      </w:r>
+      <w:r>
+        <w:rPr>
+          <w:bCs/>
+          <w:b/>
+        </w:rPr>
+        <w:t xml:space="preserve"> </w:t>
+      </w:r>
+      <w:r>
+        <w:rPr>
+          <w:bCs/>
+          <w:b/>
+        </w:rPr>
+        <w:t xml:space="preserve">surface and left the rest unmeasured and undefended.</w:t>
+      </w:r>
+    </w:p>
+    <w:bookmarkEnd w:id="27"/>
+    <w:bookmarkStart w:id="28" w:name="the-role-of-this-series"/>
+    <w:p>
+      <w:pPr>
+        <w:pStyle w:val="Heading2"/>
+      </w:pPr>
+      <w:r>
+        <w:rPr>
+          <w:rStyle w:val="SectionNumber"/>
+        </w:rPr>
+        <w:t xml:space="preserve">1.4</w:t>
+      </w:r>
+      <w:r>
+        <w:tab/>
+      </w:r>
+      <w:r>
+        <w:t xml:space="preserve">The Role of This Series</w:t>
+      </w:r>
+    </w:p>
+    <w:p>
+      <w:pPr>
+        <w:pStyle w:val="FirstParagraph"/>
+      </w:pPr>
+      <w:r>
+        <w:t xml:space="preserve">This series is the architectural planning and implementation layer that makes</w:t>
+      </w:r>
+      <w:r>
+        <w:t xml:space="preserve"> </w:t>
+      </w:r>
+      <w:r>
+        <w:t xml:space="preserve">assessment tools meaningful. It answers:</w:t>
+      </w:r>
+    </w:p>
+    <w:p>
+      <w:pPr>
+        <w:numPr>
+          <w:ilvl w:val="0"/>
+          <w:numId w:val="1003"/>
+        </w:numPr>
+        <w:pStyle w:val="Compact"/>
+      </w:pPr>
+      <w:r>
+        <w:rPr>
+          <w:bCs/>
+          <w:b/>
+        </w:rPr>
+        <w:t xml:space="preserve">Why</w:t>
+      </w:r>
+      <w:r>
+        <w:t xml:space="preserve"> </w:t>
+      </w:r>
+      <w:r>
+        <w:t xml:space="preserve">the current architecture cannot satisfy the controls — not as a</w:t>
+      </w:r>
+      <w:r>
+        <w:t xml:space="preserve"> </w:t>
+      </w:r>
+      <w:r>
+        <w:t xml:space="preserve">configuration problem, but as a structural mismatch between the perimeter</w:t>
+      </w:r>
+      <w:r>
+        <w:t xml:space="preserve"> </w:t>
+      </w:r>
+      <w:r>
+        <w:t xml:space="preserve">model and the Zero Trust control requirements</w:t>
+      </w:r>
+    </w:p>
+    <w:p>
+      <w:pPr>
+        <w:numPr>
+          <w:ilvl w:val="0"/>
+          <w:numId w:val="1003"/>
+        </w:numPr>
+        <w:pStyle w:val="Compact"/>
+      </w:pPr>
+      <w:r>
+        <w:rPr>
+          <w:bCs/>
+          <w:b/>
+        </w:rPr>
+        <w:t xml:space="preserve">What</w:t>
+      </w:r>
+      <w:r>
+        <w:t xml:space="preserve"> </w:t>
+      </w:r>
+      <w:r>
+        <w:t xml:space="preserve">architectural patterns close each control family with continuously-</w:t>
+      </w:r>
+      <w:r>
+        <w:t xml:space="preserve"> </w:t>
+      </w:r>
+      <w:r>
+        <w:t xml:space="preserve">generated, machine-readable evidence</w:t>
+      </w:r>
+    </w:p>
+    <w:p>
+      <w:pPr>
+        <w:numPr>
+          <w:ilvl w:val="0"/>
+          <w:numId w:val="1003"/>
+        </w:numPr>
+        <w:pStyle w:val="Compact"/>
+      </w:pPr>
+      <w:r>
+        <w:rPr>
+          <w:bCs/>
+          <w:b/>
+        </w:rPr>
+        <w:t xml:space="preserve">How</w:t>
+      </w:r>
+      <w:r>
+        <w:t xml:space="preserve"> </w:t>
+      </w:r>
+      <w:r>
+        <w:t xml:space="preserve">to sequence the implementation across the network, identity, data,</w:t>
+      </w:r>
+      <w:r>
+        <w:t xml:space="preserve"> </w:t>
+      </w:r>
+      <w:r>
+        <w:t xml:space="preserve">operations, and governance planes without creating new gaps in the process</w:t>
+      </w:r>
+    </w:p>
+    <w:p>
+      <w:pPr>
+        <w:numPr>
+          <w:ilvl w:val="0"/>
+          <w:numId w:val="1003"/>
+        </w:numPr>
+        <w:pStyle w:val="Compact"/>
+      </w:pPr>
+      <w:r>
+        <w:rPr>
+          <w:bCs/>
+          <w:b/>
+        </w:rPr>
+        <w:t xml:space="preserve">When</w:t>
+      </w:r>
+      <w:r>
+        <w:t xml:space="preserve"> </w:t>
+      </w:r>
+      <w:r>
+        <w:t xml:space="preserve">the KSI evidence becomes evaluable under FedRAMP 20x rules</w:t>
+      </w:r>
+      <w:r>
+        <w:t xml:space="preserve"> </w:t>
+      </w:r>
+      <w:r>
+        <w:t xml:space="preserve">(BOD 26-04 deadlines, Class A/B/C authorization windows)</w:t>
+      </w:r>
+    </w:p>
+    <w:p>
+      <w:pPr>
+        <w:pStyle w:val="FirstParagraph"/>
+      </w:pPr>
+      <w:r>
+        <w:t xml:space="preserve">When this series is implemented, SCuBAGear and ZTTT become the final</w:t>
+      </w:r>
+      <w:r>
+        <w:t xml:space="preserve"> </w:t>
+      </w:r>
+      <w:r>
+        <w:t xml:space="preserve">confirmation step — a validation that the architecture is producing the</w:t>
+      </w:r>
+      <w:r>
+        <w:t xml:space="preserve"> </w:t>
+      </w:r>
+      <w:r>
+        <w:t xml:space="preserve">compliance state it was designed to produce. That is the correct role for</w:t>
+      </w:r>
+      <w:r>
+        <w:t xml:space="preserve"> </w:t>
+      </w:r>
+      <w:r>
+        <w:t xml:space="preserve">assessment tools:</w:t>
+      </w:r>
+      <w:r>
+        <w:t xml:space="preserve"> </w:t>
+      </w:r>
+      <w:r>
+        <w:rPr>
+          <w:bCs/>
+          <w:b/>
+        </w:rPr>
+        <w:t xml:space="preserve">the final proof, not the starting point.</w:t>
+      </w:r>
+    </w:p>
+    <w:p>
+      <w:r>
+        <w:pict>
+          <v:rect style="width:0;height:1.5pt" o:hralign="center" o:hrstd="t" o:hr="t"/>
+        </w:pict>
+      </w:r>
+    </w:p>
+    <w:bookmarkEnd w:id="28"/>
+    <w:bookmarkEnd w:id="29"/>
+    <w:bookmarkStart w:id="30" w:name="Xd8412075ae72a1334f7aea052d8fa68fa2dbbc2"/>
+    <w:p>
+      <w:pPr>
+        <w:pStyle w:val="Heading1"/>
+      </w:pPr>
+      <w:r>
+        <w:rPr>
+          <w:rStyle w:val="SectionNumber"/>
+        </w:rPr>
+        <w:t xml:space="preserve">2</w:t>
       </w:r>
       <w:r>
         <w:tab/>
@@ -2278,8 +3490,8 @@
         </w:pict>
       </w:r>
     </w:p>
-    <w:bookmarkEnd w:id="25"/>
-    <w:bookmarkStart w:id="28" w:name="X6f9a64b586cbcc7969c4f245976846e0504a959"/>
+    <w:bookmarkEnd w:id="30"/>
+    <w:bookmarkStart w:id="33" w:name="X6f9a64b586cbcc7969c4f245976846e0504a959"/>
     <w:p>
       <w:pPr>
         <w:pStyle w:val="Heading1"/>
@@ -2288,7 +3500,7 @@
         <w:rPr>
           <w:rStyle w:val="SectionNumber"/>
         </w:rPr>
-        <w:t xml:space="preserve">2</w:t>
+        <w:t xml:space="preserve">3</w:t>
       </w:r>
       <w:r>
         <w:tab/>
@@ -2297,7 +3509,7 @@
         <w:t xml:space="preserve">Part 1 — Landing Zone DDI: InfoBlox DDI Closes 16 NIST Controls</w:t>
       </w:r>
     </w:p>
-    <w:bookmarkStart w:id="26" w:name="what-this-document-addresses"/>
+    <w:bookmarkStart w:id="31" w:name="what-this-document-addresses"/>
     <w:p>
       <w:pPr>
         <w:pStyle w:val="Heading2"/>
@@ -2306,7 +3518,7 @@
         <w:rPr>
           <w:rStyle w:val="SectionNumber"/>
         </w:rPr>
-        <w:t xml:space="preserve">2.1</w:t>
+        <w:t xml:space="preserve">3.1</w:t>
       </w:r>
       <w:r>
         <w:tab/>
@@ -2357,8 +3569,8 @@
         <w:t xml:space="preserve">that would otherwise require manual evidence assembly from four separate sources.</w:t>
       </w:r>
     </w:p>
-    <w:bookmarkEnd w:id="26"/>
-    <w:bookmarkStart w:id="27" w:name="nist-control-closure-part-1"/>
+    <w:bookmarkEnd w:id="31"/>
+    <w:bookmarkStart w:id="32" w:name="nist-control-closure-part-1"/>
     <w:p>
       <w:pPr>
         <w:pStyle w:val="Heading2"/>
@@ -2367,7 +3579,7 @@
         <w:rPr>
           <w:rStyle w:val="SectionNumber"/>
         </w:rPr>
-        <w:t xml:space="preserve">2.2</w:t>
+        <w:t xml:space="preserve">3.2</w:t>
       </w:r>
       <w:r>
         <w:tab/>
@@ -3925,9 +5137,9 @@
         </w:pict>
       </w:r>
     </w:p>
-    <w:bookmarkEnd w:id="27"/>
-    <w:bookmarkEnd w:id="28"/>
-    <w:bookmarkStart w:id="31" w:name="X30ea934eea704269ad669831dc25cc2e78742e3"/>
+    <w:bookmarkEnd w:id="32"/>
+    <w:bookmarkEnd w:id="33"/>
+    <w:bookmarkStart w:id="36" w:name="X30ea934eea704269ad669831dc25cc2e78742e3"/>
     <w:p>
       <w:pPr>
         <w:pStyle w:val="Heading1"/>
@@ -3936,7 +5148,7 @@
         <w:rPr>
           <w:rStyle w:val="SectionNumber"/>
         </w:rPr>
-        <w:t xml:space="preserve">3</w:t>
+        <w:t xml:space="preserve">4</w:t>
       </w:r>
       <w:r>
         <w:tab/>
@@ -3945,7 +5157,7 @@
         <w:t xml:space="preserve">Part 2 — Telecommunications Modernization: SD-WAN + SASE Closes 7 NIST Controls</w:t>
       </w:r>
     </w:p>
-    <w:bookmarkStart w:id="29" w:name="what-this-document-addresses-1"/>
+    <w:bookmarkStart w:id="34" w:name="what-this-document-addresses-1"/>
     <w:p>
       <w:pPr>
         <w:pStyle w:val="Heading2"/>
@@ -3954,7 +5166,7 @@
         <w:rPr>
           <w:rStyle w:val="SectionNumber"/>
         </w:rPr>
-        <w:t xml:space="preserve">3.1</w:t>
+        <w:t xml:space="preserve">4.1</w:t>
       </w:r>
       <w:r>
         <w:tab/>
@@ -4027,8 +5239,8 @@
         <w:t xml:space="preserve">DIA is a pipe. The NIST control requirements for information flow enforcement, boundary protection, transmission confidentiality, malware protection, system monitoring, audit logging, and continuous monitoring are satisfied by the SASE and SD-WAN control stack that governs the pipe — not by the pipe itself.</w:t>
       </w:r>
     </w:p>
-    <w:bookmarkEnd w:id="29"/>
-    <w:bookmarkStart w:id="30" w:name="nist-control-closure-part-2"/>
+    <w:bookmarkEnd w:id="34"/>
+    <w:bookmarkStart w:id="35" w:name="nist-control-closure-part-2"/>
     <w:p>
       <w:pPr>
         <w:pStyle w:val="Heading2"/>
@@ -4037,7 +5249,7 @@
         <w:rPr>
           <w:rStyle w:val="SectionNumber"/>
         </w:rPr>
-        <w:t xml:space="preserve">3.2</w:t>
+        <w:t xml:space="preserve">4.2</w:t>
       </w:r>
       <w:r>
         <w:tab/>
@@ -4987,9 +6199,9 @@
         </w:pict>
       </w:r>
     </w:p>
-    <w:bookmarkEnd w:id="30"/>
-    <w:bookmarkEnd w:id="31"/>
-    <w:bookmarkStart w:id="34" w:name="X75e1654d20273f424251f16299992daf7279c1b"/>
+    <w:bookmarkEnd w:id="35"/>
+    <w:bookmarkEnd w:id="36"/>
+    <w:bookmarkStart w:id="39" w:name="X75e1654d20273f424251f16299992daf7279c1b"/>
     <w:p>
       <w:pPr>
         <w:pStyle w:val="Heading1"/>
@@ -4998,7 +6210,7 @@
         <w:rPr>
           <w:rStyle w:val="SectionNumber"/>
         </w:rPr>
-        <w:t xml:space="preserve">4</w:t>
+        <w:t xml:space="preserve">5</w:t>
       </w:r>
       <w:r>
         <w:tab/>
@@ -5007,7 +6219,7 @@
         <w:t xml:space="preserve">Part 3 — Network and Identity Modernization: Entra ID + ZTNA + Active Governance Closes 12 NIST Controls</w:t>
       </w:r>
     </w:p>
-    <w:bookmarkStart w:id="32" w:name="what-this-document-addresses-2"/>
+    <w:bookmarkStart w:id="37" w:name="what-this-document-addresses-2"/>
     <w:p>
       <w:pPr>
         <w:pStyle w:val="Heading2"/>
@@ -5016,7 +6228,7 @@
         <w:rPr>
           <w:rStyle w:val="SectionNumber"/>
         </w:rPr>
-        <w:t xml:space="preserve">4.1</w:t>
+        <w:t xml:space="preserve">5.1</w:t>
       </w:r>
       <w:r>
         <w:tab/>
@@ -5045,7 +6257,7 @@
       <w:pPr>
         <w:numPr>
           <w:ilvl w:val="0"/>
-          <w:numId w:val="1001"/>
+          <w:numId w:val="1004"/>
         </w:numPr>
         <w:pStyle w:val="Compact"/>
       </w:pPr>
@@ -5067,7 +6279,7 @@
       <w:pPr>
         <w:numPr>
           <w:ilvl w:val="0"/>
-          <w:numId w:val="1001"/>
+          <w:numId w:val="1004"/>
         </w:numPr>
         <w:pStyle w:val="Compact"/>
       </w:pPr>
@@ -5089,7 +6301,7 @@
       <w:pPr>
         <w:numPr>
           <w:ilvl w:val="0"/>
-          <w:numId w:val="1001"/>
+          <w:numId w:val="1004"/>
         </w:numPr>
         <w:pStyle w:val="Compact"/>
       </w:pPr>
@@ -5111,7 +6323,7 @@
       <w:pPr>
         <w:numPr>
           <w:ilvl w:val="0"/>
-          <w:numId w:val="1001"/>
+          <w:numId w:val="1004"/>
         </w:numPr>
         <w:pStyle w:val="Compact"/>
       </w:pPr>
@@ -5129,8 +6341,8 @@
         <w:t xml:space="preserve">— a control plane that holds desired state, observes actual state, classifies drift, and reconciles toward intent while generating machine-readable evidence continuously</w:t>
       </w:r>
     </w:p>
-    <w:bookmarkEnd w:id="32"/>
-    <w:bookmarkStart w:id="33" w:name="nist-control-closure-part-3"/>
+    <w:bookmarkEnd w:id="37"/>
+    <w:bookmarkStart w:id="38" w:name="nist-control-closure-part-3"/>
     <w:p>
       <w:pPr>
         <w:pStyle w:val="Heading2"/>
@@ -5139,7 +6351,7 @@
         <w:rPr>
           <w:rStyle w:val="SectionNumber"/>
         </w:rPr>
-        <w:t xml:space="preserve">4.2</w:t>
+        <w:t xml:space="preserve">5.2</w:t>
       </w:r>
       <w:r>
         <w:tab/>
@@ -6307,9 +7519,9 @@
         </w:pict>
       </w:r>
     </w:p>
-    <w:bookmarkEnd w:id="33"/>
-    <w:bookmarkEnd w:id="34"/>
-    <w:bookmarkStart w:id="38" w:name="Xd252ab34334012dd1d4c02437079d82f9ec3c20"/>
+    <w:bookmarkEnd w:id="38"/>
+    <w:bookmarkEnd w:id="39"/>
+    <w:bookmarkStart w:id="43" w:name="Xd252ab34334012dd1d4c02437079d82f9ec3c20"/>
     <w:p>
       <w:pPr>
         <w:pStyle w:val="Heading1"/>
@@ -6318,7 +7530,7 @@
         <w:rPr>
           <w:rStyle w:val="SectionNumber"/>
         </w:rPr>
-        <w:t xml:space="preserve">5</w:t>
+        <w:t xml:space="preserve">6</w:t>
       </w:r>
       <w:r>
         <w:tab/>
@@ -6327,7 +7539,7 @@
         <w:t xml:space="preserve">Parts 4–6 — SQL Server and Database Architecture</w:t>
       </w:r>
     </w:p>
-    <w:bookmarkStart w:id="35" w:name="what-these-documents-address"/>
+    <w:bookmarkStart w:id="40" w:name="what-these-documents-address"/>
     <w:p>
       <w:pPr>
         <w:pStyle w:val="Heading2"/>
@@ -6336,7 +7548,7 @@
         <w:rPr>
           <w:rStyle w:val="SectionNumber"/>
         </w:rPr>
-        <w:t xml:space="preserve">5.1</w:t>
+        <w:t xml:space="preserve">6.1</w:t>
       </w:r>
       <w:r>
         <w:tab/>
@@ -6407,8 +7619,8 @@
         <w:t xml:space="preserve">addresses the architectural substrate: logical vs. physical centralization, the speed-of-light propagation floor that constrains cross-region consistency, SD-WAN traffic class separation for database replication traffic, token-based security as a database consolidation enabler, and the consistency class to transport class alignment rule.</w:t>
       </w:r>
     </w:p>
-    <w:bookmarkEnd w:id="35"/>
-    <w:bookmarkStart w:id="36" w:name="X19fcd4aef2aa8044043fe8006e12f2222ec8243"/>
+    <w:bookmarkEnd w:id="40"/>
+    <w:bookmarkStart w:id="41" w:name="X19fcd4aef2aa8044043fe8006e12f2222ec8243"/>
     <w:p>
       <w:pPr>
         <w:pStyle w:val="Heading2"/>
@@ -6417,7 +7629,7 @@
         <w:rPr>
           <w:rStyle w:val="SectionNumber"/>
         </w:rPr>
-        <w:t xml:space="preserve">5.2</w:t>
+        <w:t xml:space="preserve">6.2</w:t>
       </w:r>
       <w:r>
         <w:tab/>
@@ -7404,8 +8616,8 @@
         <w:t xml:space="preserve">IA-2, IA-3, IA-5, AC-2, AC-3, AC-17, AU-2/AU-12, CA-7, CM-2/CM-8, SC-8, SI-4 — all are deepened closures of controls addressed in Parts 1–3 at the identity and network layers, now extended to the database authentication layer.</w:t>
       </w:r>
     </w:p>
-    <w:bookmarkEnd w:id="36"/>
-    <w:bookmarkStart w:id="37" w:name="Xaffe3f4ea1f8c7a262674aad82b0a753f6b690f"/>
+    <w:bookmarkEnd w:id="41"/>
+    <w:bookmarkStart w:id="42" w:name="Xaffe3f4ea1f8c7a262674aad82b0a753f6b690f"/>
     <w:p>
       <w:pPr>
         <w:pStyle w:val="Heading2"/>
@@ -7414,7 +8626,7 @@
         <w:rPr>
           <w:rStyle w:val="SectionNumber"/>
         </w:rPr>
-        <w:t xml:space="preserve">5.3</w:t>
+        <w:t xml:space="preserve">6.3</w:t>
       </w:r>
       <w:r>
         <w:tab/>
@@ -8200,9 +9412,9 @@
         </w:pict>
       </w:r>
     </w:p>
-    <w:bookmarkEnd w:id="37"/>
-    <w:bookmarkEnd w:id="38"/>
-    <w:bookmarkStart w:id="40" w:name="parts-714-expanded-control-coverage"/>
+    <w:bookmarkEnd w:id="42"/>
+    <w:bookmarkEnd w:id="43"/>
+    <w:bookmarkStart w:id="45" w:name="parts-714-expanded-control-coverage"/>
     <w:p>
       <w:pPr>
         <w:pStyle w:val="Heading1"/>
@@ -8211,7 +9423,7 @@
         <w:rPr>
           <w:rStyle w:val="SectionNumber"/>
         </w:rPr>
-        <w:t xml:space="preserve">6</w:t>
+        <w:t xml:space="preserve">7</w:t>
       </w:r>
       <w:r>
         <w:tab/>
@@ -8253,7 +9465,7 @@
         <w:t xml:space="preserve">. Parts 12–14 close the three control families the network and security architecture documents cannot address on their own: supply chain risk management, program management governance, and PII processing transparency.</w:t>
       </w:r>
     </w:p>
-    <w:bookmarkStart w:id="39" w:name="nist-control-closure-parts-714"/>
+    <w:bookmarkStart w:id="44" w:name="nist-control-closure-parts-714"/>
     <w:p>
       <w:pPr>
         <w:pStyle w:val="Heading2"/>
@@ -8262,7 +9474,7 @@
         <w:rPr>
           <w:rStyle w:val="SectionNumber"/>
         </w:rPr>
-        <w:t xml:space="preserve">6.1</w:t>
+        <w:t xml:space="preserve">7.1</w:t>
       </w:r>
       <w:r>
         <w:tab/>
@@ -8846,9 +10058,9 @@
         </w:pict>
       </w:r>
     </w:p>
-    <w:bookmarkEnd w:id="39"/>
-    <w:bookmarkEnd w:id="40"/>
-    <w:bookmarkStart w:id="47" w:name="combined-control-closure-summary"/>
+    <w:bookmarkEnd w:id="44"/>
+    <w:bookmarkEnd w:id="45"/>
+    <w:bookmarkStart w:id="52" w:name="combined-control-closure-summary"/>
     <w:p>
       <w:pPr>
         <w:pStyle w:val="Heading1"/>
@@ -8857,7 +10069,7 @@
         <w:rPr>
           <w:rStyle w:val="SectionNumber"/>
         </w:rPr>
-        <w:t xml:space="preserve">7</w:t>
+        <w:t xml:space="preserve">8</w:t>
       </w:r>
       <w:r>
         <w:tab/>
@@ -8875,18 +10087,18 @@
           <wp:inline>
             <wp:extent cx="7772400" cy="4035668"/>
             <wp:effectExtent b="0" l="0" r="0" t="0"/>
-            <wp:docPr descr="NIST SP 800-53 Control Closure by Family and Track — All Six Parts" title="" id="42" name="Picture"/>
+            <wp:docPr descr="NIST SP 800-53 Control Closure by Family and Track — All Six Parts" title="" id="47" name="Picture"/>
             <a:graphic>
               <a:graphicData uri="http://schemas.openxmlformats.org/drawingml/2006/picture">
                 <pic:pic>
                   <pic:nvPicPr>
-                    <pic:cNvPr descr="figs/es-fig-02-control-closure-chart.png" id="43" name="Picture"/>
+                    <pic:cNvPr descr="figs/es-fig-02-control-closure-chart.png" id="48" name="Picture"/>
                     <pic:cNvPicPr>
                       <a:picLocks noChangeArrowheads="1" noChangeAspect="1"/>
                     </pic:cNvPicPr>
                   </pic:nvPicPr>
                   <pic:blipFill>
-                    <a:blip r:embed="rId41"/>
+                    <a:blip r:embed="rId46"/>
                     <a:stretch>
                       <a:fillRect/>
                     </a:stretch>
@@ -8921,7 +10133,7 @@
         <w:t xml:space="preserve">NIST SP 800-53 Control Closure by Family and Track — All Six Parts</w:t>
       </w:r>
     </w:p>
-    <w:bookmarkStart w:id="44" w:name="X9338e32c6e8ebad6c3f8cbbfe99c79ac65ab982"/>
+    <w:bookmarkStart w:id="49" w:name="X9338e32c6e8ebad6c3f8cbbfe99c79ac65ab982"/>
     <w:p>
       <w:pPr>
         <w:pStyle w:val="Heading2"/>
@@ -8930,7 +10142,7 @@
         <w:rPr>
           <w:rStyle w:val="SectionNumber"/>
         </w:rPr>
-        <w:t xml:space="preserve">7.1</w:t>
+        <w:t xml:space="preserve">8.1</w:t>
       </w:r>
       <w:r>
         <w:tab/>
@@ -9675,8 +10887,8 @@
         </w:tc>
       </w:tr>
     </w:tbl>
-    <w:bookmarkEnd w:id="44"/>
-    <w:bookmarkStart w:id="45" w:name="control-count-comparison"/>
+    <w:bookmarkEnd w:id="49"/>
+    <w:bookmarkStart w:id="50" w:name="control-count-comparison"/>
     <w:p>
       <w:pPr>
         <w:pStyle w:val="Heading2"/>
@@ -9685,7 +10897,7 @@
         <w:rPr>
           <w:rStyle w:val="SectionNumber"/>
         </w:rPr>
-        <w:t xml:space="preserve">7.2</w:t>
+        <w:t xml:space="preserve">8.2</w:t>
       </w:r>
       <w:r>
         <w:tab/>
@@ -10193,8 +11405,8 @@
         <w:t xml:space="preserve">Several controls appear across multiple tracks (SC-7, SC-8, SC-20/21, AU-2/AU-12, CM-8, CA-7). Where multiple tracks address the same control at different layers (e.g., DNS-layer SC-7 in Part 1, network-layer SC-7 in Part 2, database-layer authentication in Parts 4–5), both implementations contribute. The 34 count is of distinct control numbers — the total implementation coverage across all layers of each control is broader.</w:t>
       </w:r>
     </w:p>
-    <w:bookmarkEnd w:id="45"/>
-    <w:bookmarkStart w:id="46" w:name="what-closed-means-under-fedramp-20x"/>
+    <w:bookmarkEnd w:id="50"/>
+    <w:bookmarkStart w:id="51" w:name="what-closed-means-under-fedramp-20x"/>
     <w:p>
       <w:pPr>
         <w:pStyle w:val="Heading2"/>
@@ -10203,7 +11415,7 @@
         <w:rPr>
           <w:rStyle w:val="SectionNumber"/>
         </w:rPr>
-        <w:t xml:space="preserve">7.3</w:t>
+        <w:t xml:space="preserve">8.3</w:t>
       </w:r>
       <w:r>
         <w:tab/>
@@ -10273,7 +11485,7 @@
       <w:pPr>
         <w:numPr>
           <w:ilvl w:val="0"/>
-          <w:numId w:val="1002"/>
+          <w:numId w:val="1005"/>
         </w:numPr>
         <w:pStyle w:val="Compact"/>
       </w:pPr>
@@ -10301,7 +11513,7 @@
       <w:pPr>
         <w:numPr>
           <w:ilvl w:val="0"/>
-          <w:numId w:val="1002"/>
+          <w:numId w:val="1005"/>
         </w:numPr>
         <w:pStyle w:val="Compact"/>
       </w:pPr>
@@ -10329,7 +11541,7 @@
       <w:pPr>
         <w:numPr>
           <w:ilvl w:val="0"/>
-          <w:numId w:val="1002"/>
+          <w:numId w:val="1005"/>
         </w:numPr>
         <w:pStyle w:val="Compact"/>
       </w:pPr>
@@ -10357,7 +11569,7 @@
       <w:pPr>
         <w:numPr>
           <w:ilvl w:val="0"/>
-          <w:numId w:val="1002"/>
+          <w:numId w:val="1005"/>
         </w:numPr>
         <w:pStyle w:val="Compact"/>
       </w:pPr>
@@ -10393,7 +11605,7 @@
       <w:pPr>
         <w:numPr>
           <w:ilvl w:val="0"/>
-          <w:numId w:val="1003"/>
+          <w:numId w:val="1006"/>
         </w:numPr>
         <w:pStyle w:val="Compact"/>
       </w:pPr>
@@ -10415,7 +11627,7 @@
       <w:pPr>
         <w:numPr>
           <w:ilvl w:val="0"/>
-          <w:numId w:val="1003"/>
+          <w:numId w:val="1006"/>
         </w:numPr>
         <w:pStyle w:val="Compact"/>
       </w:pPr>
@@ -10437,7 +11649,7 @@
       <w:pPr>
         <w:numPr>
           <w:ilvl w:val="0"/>
-          <w:numId w:val="1003"/>
+          <w:numId w:val="1006"/>
         </w:numPr>
         <w:pStyle w:val="Compact"/>
       </w:pPr>
@@ -10459,7 +11671,7 @@
       <w:pPr>
         <w:numPr>
           <w:ilvl w:val="0"/>
-          <w:numId w:val="1003"/>
+          <w:numId w:val="1006"/>
         </w:numPr>
         <w:pStyle w:val="Compact"/>
       </w:pPr>
@@ -10481,7 +11693,7 @@
       <w:pPr>
         <w:numPr>
           <w:ilvl w:val="0"/>
-          <w:numId w:val="1003"/>
+          <w:numId w:val="1006"/>
         </w:numPr>
         <w:pStyle w:val="Compact"/>
       </w:pPr>
@@ -10530,9 +11742,9 @@
         </w:pict>
       </w:r>
     </w:p>
-    <w:bookmarkEnd w:id="46"/>
-    <w:bookmarkEnd w:id="47"/>
-    <w:bookmarkStart w:id="52" w:name="X13ad49f0ab0a3c4624d7046d7573c0f02162bc7"/>
+    <w:bookmarkEnd w:id="51"/>
+    <w:bookmarkEnd w:id="52"/>
+    <w:bookmarkStart w:id="57" w:name="X13ad49f0ab0a3c4624d7046d7573c0f02162bc7"/>
     <w:p>
       <w:pPr>
         <w:pStyle w:val="Heading1"/>
@@ -10541,7 +11753,7 @@
         <w:rPr>
           <w:rStyle w:val="SectionNumber"/>
         </w:rPr>
-        <w:t xml:space="preserve">8</w:t>
+        <w:t xml:space="preserve">9</w:t>
       </w:r>
       <w:r>
         <w:tab/>
@@ -10570,7 +11782,7 @@
         <w:t xml:space="preserve">these gaps; the series is now complete across all identified control families.</w:t>
       </w:r>
     </w:p>
-    <w:bookmarkStart w:id="48" w:name="Xa81065e3c6a65dd344b5d14588b12711850ea25"/>
+    <w:bookmarkStart w:id="53" w:name="Xa81065e3c6a65dd344b5d14588b12711850ea25"/>
     <w:p>
       <w:pPr>
         <w:pStyle w:val="Heading2"/>
@@ -10579,7 +11791,7 @@
         <w:rPr>
           <w:rStyle w:val="SectionNumber"/>
         </w:rPr>
-        <w:t xml:space="preserve">8.1</w:t>
+        <w:t xml:space="preserve">9.1</w:t>
       </w:r>
       <w:r>
         <w:tab/>
@@ -10669,8 +11881,8 @@
         <w:t xml:space="preserve">KSI-SCR-MON activated at high confidence.</w:t>
       </w:r>
     </w:p>
-    <w:bookmarkEnd w:id="48"/>
-    <w:bookmarkStart w:id="49" w:name="pm-program-management"/>
+    <w:bookmarkEnd w:id="53"/>
+    <w:bookmarkStart w:id="54" w:name="pm-program-management"/>
     <w:p>
       <w:pPr>
         <w:pStyle w:val="Heading2"/>
@@ -10679,7 +11891,7 @@
         <w:rPr>
           <w:rStyle w:val="SectionNumber"/>
         </w:rPr>
-        <w:t xml:space="preserve">8.2</w:t>
+        <w:t xml:space="preserve">9.2</w:t>
       </w:r>
       <w:r>
         <w:tab/>
@@ -10750,8 +11962,8 @@
         <w:t xml:space="preserve">T&amp;T&amp;M plan. KSI-SCR governance closure at high confidence.</w:t>
       </w:r>
     </w:p>
-    <w:bookmarkEnd w:id="49"/>
-    <w:bookmarkStart w:id="50" w:name="pt-pii-processing-and-transparency"/>
+    <w:bookmarkEnd w:id="54"/>
+    <w:bookmarkStart w:id="55" w:name="pt-pii-processing-and-transparency"/>
     <w:p>
       <w:pPr>
         <w:pStyle w:val="Heading2"/>
@@ -10760,7 +11972,7 @@
         <w:rPr>
           <w:rStyle w:val="SectionNumber"/>
         </w:rPr>
-        <w:t xml:space="preserve">8.3</w:t>
+        <w:t xml:space="preserve">9.3</w:t>
       </w:r>
       <w:r>
         <w:tab/>
@@ -10837,8 +12049,8 @@
         <w:t xml:space="preserve">at high confidence.</w:t>
       </w:r>
     </w:p>
-    <w:bookmarkEnd w:id="50"/>
-    <w:bookmarkStart w:id="51" w:name="priority-4-cr26-breadth-gaps"/>
+    <w:bookmarkEnd w:id="55"/>
+    <w:bookmarkStart w:id="56" w:name="priority-4-cr26-breadth-gaps"/>
     <w:p>
       <w:pPr>
         <w:pStyle w:val="Heading2"/>
@@ -10847,7 +12059,7 @@
         <w:rPr>
           <w:rStyle w:val="SectionNumber"/>
         </w:rPr>
-        <w:t xml:space="preserve">8.4</w:t>
+        <w:t xml:space="preserve">9.4</w:t>
       </w:r>
       <w:r>
         <w:tab/>
@@ -10883,9 +12095,9 @@
         </w:pict>
       </w:r>
     </w:p>
-    <w:bookmarkEnd w:id="51"/>
-    <w:bookmarkEnd w:id="52"/>
-    <w:bookmarkStart w:id="53" w:name="Xe8a0cfc3dacfc499165fbb6b52941ca764a0109"/>
+    <w:bookmarkEnd w:id="56"/>
+    <w:bookmarkEnd w:id="57"/>
+    <w:bookmarkStart w:id="58" w:name="Xe8a0cfc3dacfc499165fbb6b52941ca764a0109"/>
     <w:p>
       <w:pPr>
         <w:pStyle w:val="Heading1"/>
@@ -10894,7 +12106,7 @@
         <w:rPr>
           <w:rStyle w:val="SectionNumber"/>
         </w:rPr>
-        <w:t xml:space="preserve">9</w:t>
+        <w:t xml:space="preserve">10</w:t>
       </w:r>
       <w:r>
         <w:tab/>
@@ -11223,7 +12435,7 @@
       <w:pPr>
         <w:numPr>
           <w:ilvl w:val="0"/>
-          <w:numId w:val="1004"/>
+          <w:numId w:val="1007"/>
         </w:numPr>
         <w:pStyle w:val="Compact"/>
       </w:pPr>
@@ -11235,7 +12447,7 @@
       <w:pPr>
         <w:numPr>
           <w:ilvl w:val="0"/>
-          <w:numId w:val="1004"/>
+          <w:numId w:val="1007"/>
         </w:numPr>
         <w:pStyle w:val="Compact"/>
       </w:pPr>
@@ -11247,7 +12459,7 @@
       <w:pPr>
         <w:numPr>
           <w:ilvl w:val="0"/>
-          <w:numId w:val="1004"/>
+          <w:numId w:val="1007"/>
         </w:numPr>
         <w:pStyle w:val="Compact"/>
       </w:pPr>
@@ -11286,8 +12498,8 @@
         </w:pict>
       </w:r>
     </w:p>
-    <w:bookmarkEnd w:id="53"/>
-    <w:bookmarkStart w:id="59" w:name="implementation-priority-and-sequencing"/>
+    <w:bookmarkEnd w:id="58"/>
+    <w:bookmarkStart w:id="64" w:name="implementation-priority-and-sequencing"/>
     <w:p>
       <w:pPr>
         <w:pStyle w:val="Heading1"/>
@@ -11296,7 +12508,7 @@
         <w:rPr>
           <w:rStyle w:val="SectionNumber"/>
         </w:rPr>
-        <w:t xml:space="preserve">10</w:t>
+        <w:t xml:space="preserve">11</w:t>
       </w:r>
       <w:r>
         <w:tab/>
@@ -11314,18 +12526,18 @@
           <wp:inline>
             <wp:extent cx="7772400" cy="2989384"/>
             <wp:effectExtent b="0" l="0" r="0" t="0"/>
-            <wp:docPr descr="Implementation Sequencing — Path to FedRAMP 20x Mandatory Compliance by January 1 2027" title="" id="55" name="Picture"/>
+            <wp:docPr descr="Implementation Sequencing — Path to FedRAMP 20x Mandatory Compliance by January 1 2027" title="" id="60" name="Picture"/>
             <a:graphic>
               <a:graphicData uri="http://schemas.openxmlformats.org/drawingml/2006/picture">
                 <pic:pic>
                   <pic:nvPicPr>
-                    <pic:cNvPr descr="figs/es-fig-04-sequencing-roadmap.png" id="56" name="Picture"/>
+                    <pic:cNvPr descr="figs/es-fig-04-sequencing-roadmap.png" id="61" name="Picture"/>
                     <pic:cNvPicPr>
                       <a:picLocks noChangeArrowheads="1" noChangeAspect="1"/>
                     </pic:cNvPicPr>
                   </pic:nvPicPr>
                   <pic:blipFill>
-                    <a:blip r:embed="rId54"/>
+                    <a:blip r:embed="rId59"/>
                     <a:stretch>
                       <a:fillRect/>
                     </a:stretch>
@@ -11731,7 +12943,7 @@
         </w:pict>
       </w:r>
     </w:p>
-    <w:bookmarkStart w:id="57" w:name="phased-delivery-roadmap"/>
+    <w:bookmarkStart w:id="62" w:name="phased-delivery-roadmap"/>
     <w:p>
       <w:pPr>
         <w:pStyle w:val="Heading2"/>
@@ -11740,7 +12952,7 @@
         <w:rPr>
           <w:rStyle w:val="SectionNumber"/>
         </w:rPr>
-        <w:t xml:space="preserve">10.1</w:t>
+        <w:t xml:space="preserve">11.1</w:t>
       </w:r>
       <w:r>
         <w:tab/>
@@ -12029,8 +13241,8 @@
         </w:pict>
       </w:r>
     </w:p>
-    <w:bookmarkEnd w:id="57"/>
-    <w:bookmarkStart w:id="58" w:name="technology-recommendations-by-gap"/>
+    <w:bookmarkEnd w:id="62"/>
+    <w:bookmarkStart w:id="63" w:name="technology-recommendations-by-gap"/>
     <w:p>
       <w:pPr>
         <w:pStyle w:val="Heading2"/>
@@ -12039,7 +13251,7 @@
         <w:rPr>
           <w:rStyle w:val="SectionNumber"/>
         </w:rPr>
-        <w:t xml:space="preserve">10.2</w:t>
+        <w:t xml:space="preserve">11.2</w:t>
       </w:r>
       <w:r>
         <w:tab/>
@@ -12270,9 +13482,9 @@
         </w:pict>
       </w:r>
     </w:p>
-    <w:bookmarkEnd w:id="58"/>
-    <w:bookmarkEnd w:id="59"/>
-    <w:bookmarkStart w:id="71" w:name="document-references"/>
+    <w:bookmarkEnd w:id="63"/>
+    <w:bookmarkEnd w:id="64"/>
+    <w:bookmarkStart w:id="76" w:name="document-references"/>
     <w:p>
       <w:pPr>
         <w:pStyle w:val="Heading1"/>
@@ -12281,7 +13493,7 @@
         <w:rPr>
           <w:rStyle w:val="SectionNumber"/>
         </w:rPr>
-        <w:t xml:space="preserve">11</w:t>
+        <w:t xml:space="preserve">12</w:t>
       </w:r>
       <w:r>
         <w:tab/>
@@ -12347,7 +13559,7 @@
               <w:pStyle w:val="Compact"/>
               <w:jc w:val="left"/>
             </w:pPr>
-            <w:hyperlink r:id="rId60">
+            <w:hyperlink r:id="rId65">
               <w:r>
                 <w:rPr>
                   <w:rStyle w:val="Hyperlink"/>
@@ -12378,7 +13590,7 @@
               <w:pStyle w:val="Compact"/>
               <w:jc w:val="left"/>
             </w:pPr>
-            <w:hyperlink r:id="rId61">
+            <w:hyperlink r:id="rId66">
               <w:r>
                 <w:rPr>
                   <w:rStyle w:val="Hyperlink"/>
@@ -12409,7 +13621,7 @@
               <w:pStyle w:val="Compact"/>
               <w:jc w:val="left"/>
             </w:pPr>
-            <w:hyperlink r:id="rId62">
+            <w:hyperlink r:id="rId67">
               <w:r>
                 <w:rPr>
                   <w:rStyle w:val="Hyperlink"/>
@@ -12440,7 +13652,7 @@
               <w:pStyle w:val="Compact"/>
               <w:jc w:val="left"/>
             </w:pPr>
-            <w:hyperlink r:id="rId63">
+            <w:hyperlink r:id="rId68">
               <w:r>
                 <w:rPr>
                   <w:rStyle w:val="Hyperlink"/>
@@ -12471,7 +13683,7 @@
               <w:pStyle w:val="Compact"/>
               <w:jc w:val="left"/>
             </w:pPr>
-            <w:hyperlink r:id="rId64">
+            <w:hyperlink r:id="rId69">
               <w:r>
                 <w:rPr>
                   <w:rStyle w:val="Hyperlink"/>
@@ -12502,7 +13714,7 @@
               <w:pStyle w:val="Compact"/>
               <w:jc w:val="left"/>
             </w:pPr>
-            <w:hyperlink r:id="rId65">
+            <w:hyperlink r:id="rId70">
               <w:r>
                 <w:rPr>
                   <w:rStyle w:val="Hyperlink"/>
@@ -12533,7 +13745,7 @@
               <w:pStyle w:val="Compact"/>
               <w:jc w:val="left"/>
             </w:pPr>
-            <w:hyperlink r:id="rId66">
+            <w:hyperlink r:id="rId71">
               <w:r>
                 <w:rPr>
                   <w:rStyle w:val="Hyperlink"/>
@@ -12564,7 +13776,7 @@
               <w:pStyle w:val="Compact"/>
               <w:jc w:val="left"/>
             </w:pPr>
-            <w:hyperlink r:id="rId67">
+            <w:hyperlink r:id="rId72">
               <w:r>
                 <w:rPr>
                   <w:rStyle w:val="Hyperlink"/>
@@ -12595,7 +13807,7 @@
               <w:pStyle w:val="Compact"/>
               <w:jc w:val="left"/>
             </w:pPr>
-            <w:hyperlink r:id="rId68">
+            <w:hyperlink r:id="rId73">
               <w:r>
                 <w:rPr>
                   <w:rStyle w:val="Hyperlink"/>
@@ -12626,7 +13838,7 @@
               <w:pStyle w:val="Compact"/>
               <w:jc w:val="left"/>
             </w:pPr>
-            <w:hyperlink r:id="rId69">
+            <w:hyperlink r:id="rId74">
               <w:r>
                 <w:rPr>
                   <w:rStyle w:val="Hyperlink"/>
@@ -12657,7 +13869,7 @@
               <w:pStyle w:val="Compact"/>
               <w:jc w:val="left"/>
             </w:pPr>
-            <w:hyperlink r:id="rId70">
+            <w:hyperlink r:id="rId75">
               <w:r>
                 <w:rPr>
                   <w:rStyle w:val="Hyperlink"/>
@@ -12863,7 +14075,7 @@
         </w:tc>
       </w:tr>
     </w:tbl>
-    <w:bookmarkEnd w:id="71"/>
+    <w:bookmarkEnd w:id="76"/>
     <w:sectPr>
       <w:pgMar w:top="720" w:right="720" w:bottom="720" w:left="720" w:header="720" w:footer="720" w:gutter="0"/>
     </w:sectPr>
@@ -12972,6 +14184,82 @@
       </w:pPr>
     </w:lvl>
   </w:abstractNum>
+  <w:abstractNum w:abstractNumId="991">
+    <w:nsid w:val="A991"/>
+    <w:multiLevelType w:val="multilevel"/>
+    <w:lvl w:ilvl="0">
+      <w:numFmt w:val="bullet"/>
+      <w:lvlText w:val="•"/>
+      <w:lvlJc w:val="left"/>
+      <w:pPr>
+        <w:ind w:left="720" w:hanging="480"/>
+      </w:pPr>
+    </w:lvl>
+    <w:lvl w:ilvl="1">
+      <w:numFmt w:val="bullet"/>
+      <w:lvlText w:val="–"/>
+      <w:lvlJc w:val="left"/>
+      <w:pPr>
+        <w:ind w:left="1440" w:hanging="480"/>
+      </w:pPr>
+    </w:lvl>
+    <w:lvl w:ilvl="2">
+      <w:numFmt w:val="bullet"/>
+      <w:lvlText w:val="•"/>
+      <w:lvlJc w:val="left"/>
+      <w:pPr>
+        <w:ind w:left="2160" w:hanging="480"/>
+      </w:pPr>
+    </w:lvl>
+    <w:lvl w:ilvl="3">
+      <w:numFmt w:val="bullet"/>
+      <w:lvlText w:val="–"/>
+      <w:lvlJc w:val="left"/>
+      <w:pPr>
+        <w:ind w:left="2880" w:hanging="480"/>
+      </w:pPr>
+    </w:lvl>
+    <w:lvl w:ilvl="4">
+      <w:numFmt w:val="bullet"/>
+      <w:lvlText w:val="•"/>
+      <w:lvlJc w:val="left"/>
+      <w:pPr>
+        <w:ind w:left="3600" w:hanging="480"/>
+      </w:pPr>
+    </w:lvl>
+    <w:lvl w:ilvl="5">
+      <w:numFmt w:val="bullet"/>
+      <w:lvlText w:val="–"/>
+      <w:lvlJc w:val="left"/>
+      <w:pPr>
+        <w:ind w:left="4320" w:hanging="480"/>
+      </w:pPr>
+    </w:lvl>
+    <w:lvl w:ilvl="6">
+      <w:numFmt w:val="bullet"/>
+      <w:lvlText w:val="•"/>
+      <w:lvlJc w:val="left"/>
+      <w:pPr>
+        <w:ind w:left="5040" w:hanging="480"/>
+      </w:pPr>
+    </w:lvl>
+    <w:lvl w:ilvl="7">
+      <w:numFmt w:val="bullet"/>
+      <w:lvlText w:val="–"/>
+      <w:lvlJc w:val="left"/>
+      <w:pPr>
+        <w:ind w:left="5760" w:hanging="480"/>
+      </w:pPr>
+    </w:lvl>
+    <w:lvl w:ilvl="8">
+      <w:numFmt w:val="bullet"/>
+      <w:lvlText w:val="•"/>
+      <w:lvlJc w:val="left"/>
+      <w:pPr>
+        <w:ind w:left="6480" w:hanging="480"/>
+      </w:pPr>
+    </w:lvl>
+  </w:abstractNum>
   <w:abstractNum w:abstractNumId="99411">
     <w:nsid w:val="A99411"/>
     <w:multiLevelType w:val="multilevel"/>
@@ -13057,86 +14345,19 @@
       </w:pPr>
     </w:lvl>
   </w:abstractNum>
-  <w:abstractNum w:abstractNumId="991">
-    <w:nsid w:val="A991"/>
-    <w:multiLevelType w:val="multilevel"/>
-    <w:lvl w:ilvl="0">
-      <w:numFmt w:val="bullet"/>
-      <w:lvlText w:val="•"/>
-      <w:lvlJc w:val="left"/>
-      <w:pPr>
-        <w:ind w:left="720" w:hanging="480"/>
-      </w:pPr>
-    </w:lvl>
-    <w:lvl w:ilvl="1">
-      <w:numFmt w:val="bullet"/>
-      <w:lvlText w:val="–"/>
-      <w:lvlJc w:val="left"/>
-      <w:pPr>
-        <w:ind w:left="1440" w:hanging="480"/>
-      </w:pPr>
-    </w:lvl>
-    <w:lvl w:ilvl="2">
-      <w:numFmt w:val="bullet"/>
-      <w:lvlText w:val="•"/>
-      <w:lvlJc w:val="left"/>
-      <w:pPr>
-        <w:ind w:left="2160" w:hanging="480"/>
-      </w:pPr>
-    </w:lvl>
-    <w:lvl w:ilvl="3">
-      <w:numFmt w:val="bullet"/>
-      <w:lvlText w:val="–"/>
-      <w:lvlJc w:val="left"/>
-      <w:pPr>
-        <w:ind w:left="2880" w:hanging="480"/>
-      </w:pPr>
-    </w:lvl>
-    <w:lvl w:ilvl="4">
-      <w:numFmt w:val="bullet"/>
-      <w:lvlText w:val="•"/>
-      <w:lvlJc w:val="left"/>
-      <w:pPr>
-        <w:ind w:left="3600" w:hanging="480"/>
-      </w:pPr>
-    </w:lvl>
-    <w:lvl w:ilvl="5">
-      <w:numFmt w:val="bullet"/>
-      <w:lvlText w:val="–"/>
-      <w:lvlJc w:val="left"/>
-      <w:pPr>
-        <w:ind w:left="4320" w:hanging="480"/>
-      </w:pPr>
-    </w:lvl>
-    <w:lvl w:ilvl="6">
-      <w:numFmt w:val="bullet"/>
-      <w:lvlText w:val="•"/>
-      <w:lvlJc w:val="left"/>
-      <w:pPr>
-        <w:ind w:left="5040" w:hanging="480"/>
-      </w:pPr>
-    </w:lvl>
-    <w:lvl w:ilvl="7">
-      <w:numFmt w:val="bullet"/>
-      <w:lvlText w:val="–"/>
-      <w:lvlJc w:val="left"/>
-      <w:pPr>
-        <w:ind w:left="5760" w:hanging="480"/>
-      </w:pPr>
-    </w:lvl>
-    <w:lvl w:ilvl="8">
-      <w:numFmt w:val="bullet"/>
-      <w:lvlText w:val="•"/>
-      <w:lvlJc w:val="left"/>
-      <w:pPr>
-        <w:ind w:left="6480" w:hanging="480"/>
-      </w:pPr>
-    </w:lvl>
-  </w:abstractNum>
   <w:num w:numId="1000">
     <w:abstractNumId w:val="990"/>
   </w:num>
   <w:num w:numId="1001">
+    <w:abstractNumId w:val="991"/>
+  </w:num>
+  <w:num w:numId="1002">
+    <w:abstractNumId w:val="991"/>
+  </w:num>
+  <w:num w:numId="1003">
+    <w:abstractNumId w:val="991"/>
+  </w:num>
+  <w:num w:numId="1004">
     <w:abstractNumId w:val="99411"/>
     <w:lvlOverride w:ilvl="0">
       <w:startOverride w:val="1"/>
@@ -13166,7 +14387,7 @@
       <w:startOverride w:val="1"/>
     </w:lvlOverride>
   </w:num>
-  <w:num w:numId="1002">
+  <w:num w:numId="1005">
     <w:abstractNumId w:val="99411"/>
     <w:lvlOverride w:ilvl="0">
       <w:startOverride w:val="1"/>
@@ -13196,10 +14417,10 @@
       <w:startOverride w:val="1"/>
     </w:lvlOverride>
   </w:num>
-  <w:num w:numId="1003">
+  <w:num w:numId="1006">
     <w:abstractNumId w:val="991"/>
   </w:num>
-  <w:num w:numId="1004">
+  <w:num w:numId="1007">
     <w:abstractNumId w:val="99411"/>
     <w:lvlOverride w:ilvl="0">
       <w:startOverride w:val="1"/>

</xml_diff>